<commit_message>
Terminologia: página do site vira "resumo prévio" e a nota técnica vira "parecer técnico"
- Site, painel, e-mails, carimbo dos PDFs, protótipos, modelos Word, guia da
  metodologia, planilha e documentação: o que o leitor vê passa a dizer
  "resumo prévio" (a página aberta) e "parecer técnico" (o PDF).
- Endereço da página: /resumos/<slug>; /pareceres e /pareceres/<slug>
  redirecionam de forma permanente (308).
- O sentido legislativo de "parecer" (parecer do relator, de comissão) e os
  nomes internos do código (coleção pareceres, campo notaTecnica) não mudam.
- modelo-nota-tecnica.docx passa a se chamar modelo-parecer-tecnico.docx.
- Teste da conta do inscrito: espera de até 15 s pelo salvamento em segundo plano.

Co-Authored-By: Claude Opus 5.5 <noreply@anthropic.com>
Claude-Session: https://claude.ai/code/session_019xgzxFHuUdfQmM6KHZGaMU
</commit_message>
<xml_diff>
--- a/docs/modelos/guia-metodologia.docx
+++ b/docs/modelos/guia-metodologia.docx
@@ -261,7 +261,7 @@
                 <w:sz w:val="18"/>
                 <w:szCs w:val="18"/>
               </w:rPr>
-              <w:t xml:space="preserve">Parecer no site</w:t>
+              <w:t xml:space="preserve">Resumo prévio (site)</w:t>
             </w:r>
           </w:p>
         </w:tc>
@@ -321,7 +321,7 @@
                 <w:sz w:val="18"/>
                 <w:szCs w:val="18"/>
               </w:rPr>
-              <w:t xml:space="preserve">Parecer prévio: texto base (literal, com o como é hoje × como fica da lei alterada), síntese, objeto e alcance, regime vigente e proposta, classificação, relevância, pontos de atenção e tramitação.</w:t>
+              <w:t xml:space="preserve">Aberto a todos: texto base (literal, com o como é hoje × como fica da lei alterada), síntese, objeto e alcance, regime vigente e proposta, classificação, relevância, pontos de atenção e tramitação.</w:t>
             </w:r>
           </w:p>
         </w:tc>
@@ -356,7 +356,7 @@
                 <w:sz w:val="18"/>
                 <w:szCs w:val="18"/>
               </w:rPr>
-              <w:t xml:space="preserve">Nota técnica (PDF)</w:t>
+              <w:t xml:space="preserve">Parecer técnico (PDF)</w:t>
             </w:r>
           </w:p>
         </w:tc>
@@ -416,7 +416,7 @@
                 <w:sz w:val="18"/>
                 <w:szCs w:val="18"/>
               </w:rPr>
-              <w:t xml:space="preserve">O parecer completo em 3 páginas de análise: texto base, leitura do cotejo, problema, hipóteses, impactos, cenários, soluções, casos, conclusão e limitações.</w:t>
+              <w:t xml:space="preserve">A análise completa em 3 páginas: texto base, leitura do cotejo, problema, hipóteses, impactos, cenários, soluções, casos, conclusão e limitações.</w:t>
             </w:r>
           </w:p>
         </w:tc>
@@ -634,7 +634,7 @@
           <w:sz w:val="21"/>
           <w:szCs w:val="21"/>
         </w:rPr>
-        <w:t xml:space="preserve">A cadeia de coerência é sempre a mesma: hipóteses (nota, parte 6) → testagem (quadro, parte B) → comparação de cenários (quadro, parte C) → conclusão (nota, parte 11) → classificação publicada no site. Um elo que muda obriga a revisar os seguintes.</w:t>
+        <w:t xml:space="preserve">A cadeia de coerência é sempre a mesma: hipóteses (parecer técnico, parte 6) → testagem (quadro, parte B) → comparação de cenários (quadro, parte C) → conclusão (parecer técnico, parte 11) → classificação publicada no resumo prévio. Um elo que muda obriga a revisar os seguintes.</w:t>
       </w:r>
     </w:p>
     <w:p>
@@ -762,7 +762,7 @@
           <w:sz w:val="21"/>
           <w:szCs w:val="21"/>
         </w:rPr>
-        <w:t xml:space="preserve">Atualização: texto mudou, o parecer ganha nova versão com "o que mudou"; o histórico fica público.</w:t>
+        <w:t xml:space="preserve">Atualização: texto mudou, o resumo prévio e o parecer técnico ganham nova versão com "o que mudou"; o histórico fica público.</w:t>
       </w:r>
     </w:p>
     <w:p>
@@ -1695,7 +1695,7 @@
           <w:sz w:val="21"/>
           <w:szCs w:val="21"/>
         </w:rPr>
-        <w:t xml:space="preserve">De 1 a 3 por nota. Opinião, valor ou desejo não são hipóteses: precisam poder ser derrubadas por um dado.</w:t>
+        <w:t xml:space="preserve">De 1 a 3 por parecer técnico. Opinião, valor ou desejo não são hipóteses: precisam poder ser derrubadas por um dado.</w:t>
       </w:r>
     </w:p>
     <w:p>
@@ -2431,7 +2431,7 @@
           <w:sz w:val="21"/>
           <w:szCs w:val="21"/>
         </w:rPr>
-        <w:t xml:space="preserve">Direção do efeito de B e C em relação a A, de −2 (piora muito) a +2 (melhora muito), em quatro dimensões fixas: ambiental, social, econômica, institucional e fiscal. Magnitude, prazo e reversibilidade vão na nota técnica (parte 7).</w:t>
+        <w:t xml:space="preserve">Direção do efeito de B e C em relação a A, de −2 (piora muito) a +2 (melhora muito), em quatro dimensões fixas: ambiental, social, econômica, institucional e fiscal. Magnitude, prazo e reversibilidade vão no parecer técnico (parte 7).</w:t>
       </w:r>
     </w:p>
     <w:p>
@@ -2935,7 +2935,7 @@
           <w:sz w:val="21"/>
           <w:szCs w:val="21"/>
         </w:rPr>
-        <w:t xml:space="preserve">Cada parecer informa a versão do texto analisado. Os PDFs saem carimbados em cada página com a identificação do parecer (versão, texto analisado, autor), o link permanente e um QR que levam à versão atual no site. Correções são registradas publicamente na página do parecer.</w:t>
+        <w:t xml:space="preserve">Cada resumo prévio e cada parecer técnico informam a versão do texto analisado. Os PDFs saem carimbados em cada página com a identificação (versão, texto analisado, autor), o link permanente e um QR que levam à versão atual no site. Correções são registradas publicamente na página do resumo prévio.</w:t>
       </w:r>
     </w:p>
     <w:p>

</xml_diff>